<commit_message>
Complete part 2_3 of Quality Plan
</commit_message>
<xml_diff>
--- a/Documents/_Fall Docs/Team 4 - Software Quality Plan Template.docx
+++ b/Documents/_Fall Docs/Team 4 - Software Quality Plan Template.docx
@@ -75,56 +75,7 @@
           <w:sz w:val="24"/>
           <w:szCs w:val="24"/>
         </w:rPr>
-        <w:t xml:space="preserve">The Intelligent Bike Dash Cam (IBDC) project provides a mobile application for reviewing ride sessions and incident evidence received from a connected </w:t>
-      </w:r>
-      <w:r>
-        <w:rPr>
-          <w:sz w:val="24"/>
-          <w:szCs w:val="24"/>
-        </w:rPr>
-        <w:t xml:space="preserve">intelligent </w:t>
-      </w:r>
-      <w:r>
-        <w:rPr>
-          <w:sz w:val="24"/>
-          <w:szCs w:val="24"/>
-        </w:rPr>
-        <w:t>bike dash cam. Team 4</w:t>
-      </w:r>
-      <w:r>
-        <w:rPr>
-          <w:sz w:val="24"/>
-          <w:szCs w:val="24"/>
-        </w:rPr>
-        <w:t>, including Matthew Edlin, Colin Tugend, Jair Franco, and Christopher Paquin</w:t>
-      </w:r>
-      <w:r>
-        <w:rPr>
-          <w:sz w:val="24"/>
-          <w:szCs w:val="24"/>
-        </w:rPr>
-        <w:t xml:space="preserve"> </w:t>
-      </w:r>
-      <w:r>
-        <w:rPr>
-          <w:sz w:val="24"/>
-          <w:szCs w:val="24"/>
-        </w:rPr>
-        <w:t>are</w:t>
-      </w:r>
-      <w:r>
-        <w:rPr>
-          <w:sz w:val="24"/>
-          <w:szCs w:val="24"/>
-        </w:rPr>
-        <w:t xml:space="preserve"> developing the application workflow that connects to the device through Bluetooth Low Energy (BLE), retrieves event information and images, stores related records locally, </w:t>
-      </w:r>
-      <w:r>
-        <w:rPr>
-          <w:sz w:val="24"/>
-          <w:szCs w:val="24"/>
-        </w:rPr>
-        <w:t>and submits anonymous data to a server-based analytics platform for the Rob Dollar foundation who commissioned this application.</w:t>
+        <w:t>The Intelligent Bike Dash Cam (IBDC) project provides a mobile application for reviewing ride sessions and incident evidence received from a connected intelligent bike dash cam. Team 4, including Matthew Edlin, Colin Tugend, Jair Franco, and Christopher Paquin are developing the application workflow that connects to the device through Bluetooth Low Energy (BLE), retrieves event information and images, stores related records locally, and submits anonymous data to a server-based analytics platform for the Rob Dollar foundation who commissioned this application.</w:t>
       </w:r>
     </w:p>
     <w:p>
@@ -491,7 +442,6 @@
         </w:rPr>
         <w:t xml:space="preserve"> device status values received through the </w:t>
       </w:r>
-      <w:proofErr w:type="spellStart"/>
       <w:r>
         <w:rPr>
           <w:sz w:val="24"/>
@@ -499,7 +449,6 @@
         </w:rPr>
         <w:t>protobuf</w:t>
       </w:r>
-      <w:proofErr w:type="spellEnd"/>
       <w:r>
         <w:rPr>
           <w:sz w:val="24"/>
@@ -900,7 +849,6 @@
         </w:rPr>
         <w:t xml:space="preserve">The application shall exchange device messages using the agreed </w:t>
       </w:r>
-      <w:proofErr w:type="spellStart"/>
       <w:r>
         <w:rPr>
           <w:sz w:val="24"/>
@@ -913,15 +861,7 @@
           <w:sz w:val="24"/>
           <w:szCs w:val="24"/>
         </w:rPr>
-        <w:t>rotobuf</w:t>
-      </w:r>
-      <w:proofErr w:type="spellEnd"/>
-      <w:r>
-        <w:rPr>
-          <w:sz w:val="24"/>
-          <w:szCs w:val="24"/>
-        </w:rPr>
-        <w:t xml:space="preserve"> schema.</w:t>
+        <w:t>rotobuf schema.</w:t>
       </w:r>
     </w:p>
     <w:p>
@@ -976,9 +916,9 @@
       </w:tblPr>
       <w:tblGrid>
         <w:gridCol w:w="923"/>
-        <w:gridCol w:w="3212"/>
-        <w:gridCol w:w="3780"/>
-        <w:gridCol w:w="1435"/>
+        <w:gridCol w:w="4022"/>
+        <w:gridCol w:w="3240"/>
+        <w:gridCol w:w="1165"/>
       </w:tblGrid>
       <w:tr>
         <w:tc>
@@ -1010,7 +950,7 @@
         </w:tc>
         <w:tc>
           <w:tcPr>
-            <w:tcW w:w="3212" w:type="dxa"/>
+            <w:tcW w:w="4022" w:type="dxa"/>
           </w:tcPr>
           <w:p>
             <w:pPr>
@@ -1037,7 +977,7 @@
         </w:tc>
         <w:tc>
           <w:tcPr>
-            <w:tcW w:w="3780" w:type="dxa"/>
+            <w:tcW w:w="3240" w:type="dxa"/>
           </w:tcPr>
           <w:p>
             <w:pPr>
@@ -1064,7 +1004,7 @@
         </w:tc>
         <w:tc>
           <w:tcPr>
-            <w:tcW w:w="1435" w:type="dxa"/>
+            <w:tcW w:w="1165" w:type="dxa"/>
           </w:tcPr>
           <w:p>
             <w:pPr>
@@ -1085,7 +1025,7 @@
                 <w:sz w:val="24"/>
                 <w:szCs w:val="24"/>
               </w:rPr>
-              <w:t>Trace</w:t>
+              <w:t>Related Req(s)</w:t>
             </w:r>
           </w:p>
         </w:tc>
@@ -1103,11 +1043,19 @@
                 <w:szCs w:val="24"/>
               </w:rPr>
             </w:pPr>
+            <w:r>
+              <w:rPr>
+                <w:rFonts w:cstheme="minorHAnsi"/>
+                <w:sz w:val="24"/>
+                <w:szCs w:val="24"/>
+              </w:rPr>
+              <w:t>M1</w:t>
+            </w:r>
           </w:p>
         </w:tc>
         <w:tc>
           <w:tcPr>
-            <w:tcW w:w="3212" w:type="dxa"/>
+            <w:tcW w:w="4022" w:type="dxa"/>
           </w:tcPr>
           <w:p>
             <w:pPr>
@@ -1117,11 +1065,19 @@
                 <w:szCs w:val="24"/>
               </w:rPr>
             </w:pPr>
+            <w:r>
+              <w:rPr>
+                <w:rFonts w:cstheme="minorHAnsi"/>
+                <w:sz w:val="24"/>
+                <w:szCs w:val="24"/>
+              </w:rPr>
+              <w:t>Measures whether the application displays the correct connection state, identifies unsupported protocol versions, and retrieves pending events after reconnecting.</w:t>
+            </w:r>
           </w:p>
         </w:tc>
         <w:tc>
           <w:tcPr>
-            <w:tcW w:w="3780" w:type="dxa"/>
+            <w:tcW w:w="3240" w:type="dxa"/>
           </w:tcPr>
           <w:p>
             <w:pPr>
@@ -1131,12 +1087,735 @@
                 <w:szCs w:val="24"/>
               </w:rPr>
             </w:pPr>
+            <w:r>
+              <w:rPr>
+                <w:rFonts w:cstheme="minorHAnsi"/>
+                <w:sz w:val="24"/>
+                <w:szCs w:val="24"/>
+              </w:rPr>
+              <w:t>100% of connection, compatibility, and pending-event recovery tests pass.</w:t>
+            </w:r>
           </w:p>
         </w:tc>
         <w:tc>
           <w:tcPr>
-            <w:tcW w:w="1435" w:type="dxa"/>
+            <w:tcW w:w="1165" w:type="dxa"/>
           </w:tcPr>
+          <w:p>
+            <w:pPr>
+              <w:rPr>
+                <w:rFonts w:cstheme="minorHAnsi"/>
+                <w:sz w:val="24"/>
+                <w:szCs w:val="24"/>
+              </w:rPr>
+            </w:pPr>
+            <w:r>
+              <w:rPr>
+                <w:rFonts w:cstheme="minorHAnsi"/>
+                <w:sz w:val="24"/>
+                <w:szCs w:val="24"/>
+              </w:rPr>
+              <w:t>R1, R2, R4</w:t>
+            </w:r>
+          </w:p>
+        </w:tc>
+      </w:tr>
+      <w:tr>
+        <w:tc>
+          <w:tcPr>
+            <w:tcW w:w="923" w:type="dxa"/>
+          </w:tcPr>
+          <w:p>
+            <w:pPr>
+              <w:rPr>
+                <w:rFonts w:cstheme="minorHAnsi"/>
+                <w:sz w:val="24"/>
+                <w:szCs w:val="24"/>
+              </w:rPr>
+            </w:pPr>
+            <w:r>
+              <w:rPr>
+                <w:rFonts w:cstheme="minorHAnsi"/>
+                <w:sz w:val="24"/>
+                <w:szCs w:val="24"/>
+              </w:rPr>
+              <w:t>M2</w:t>
+            </w:r>
+          </w:p>
+        </w:tc>
+        <w:tc>
+          <w:tcPr>
+            <w:tcW w:w="4022" w:type="dxa"/>
+          </w:tcPr>
+          <w:p>
+            <w:pPr>
+              <w:rPr>
+                <w:rFonts w:cstheme="minorHAnsi"/>
+                <w:sz w:val="24"/>
+                <w:szCs w:val="24"/>
+              </w:rPr>
+            </w:pPr>
+            <w:r>
+              <w:rPr>
+                <w:rFonts w:cstheme="minorHAnsi"/>
+                <w:sz w:val="24"/>
+                <w:szCs w:val="24"/>
+              </w:rPr>
+              <w:t>Measures whether device messages follow the agreed protobuf schema and device status values are translated correctly.</w:t>
+            </w:r>
+          </w:p>
+        </w:tc>
+        <w:tc>
+          <w:tcPr>
+            <w:tcW w:w="3240" w:type="dxa"/>
+          </w:tcPr>
+          <w:p>
+            <w:pPr>
+              <w:rPr>
+                <w:rFonts w:cstheme="minorHAnsi"/>
+                <w:sz w:val="24"/>
+                <w:szCs w:val="24"/>
+              </w:rPr>
+            </w:pPr>
+            <w:r>
+              <w:rPr>
+                <w:rFonts w:cstheme="minorHAnsi"/>
+                <w:sz w:val="24"/>
+                <w:szCs w:val="24"/>
+              </w:rPr>
+              <w:t>100% of protocol tests pass. Translated status values match the expected values in the test messages.</w:t>
+            </w:r>
+          </w:p>
+        </w:tc>
+        <w:tc>
+          <w:tcPr>
+            <w:tcW w:w="1165" w:type="dxa"/>
+          </w:tcPr>
+          <w:p>
+            <w:pPr>
+              <w:rPr>
+                <w:rFonts w:cstheme="minorHAnsi"/>
+                <w:sz w:val="24"/>
+                <w:szCs w:val="24"/>
+              </w:rPr>
+            </w:pPr>
+            <w:r>
+              <w:rPr>
+                <w:rFonts w:cstheme="minorHAnsi"/>
+                <w:sz w:val="24"/>
+                <w:szCs w:val="24"/>
+              </w:rPr>
+              <w:t>R3, R15</w:t>
+            </w:r>
+          </w:p>
+        </w:tc>
+      </w:tr>
+      <w:tr>
+        <w:tc>
+          <w:tcPr>
+            <w:tcW w:w="923" w:type="dxa"/>
+          </w:tcPr>
+          <w:p>
+            <w:pPr>
+              <w:rPr>
+                <w:rFonts w:cstheme="minorHAnsi"/>
+                <w:sz w:val="24"/>
+                <w:szCs w:val="24"/>
+              </w:rPr>
+            </w:pPr>
+            <w:r>
+              <w:rPr>
+                <w:rFonts w:cstheme="minorHAnsi"/>
+                <w:sz w:val="24"/>
+                <w:szCs w:val="24"/>
+              </w:rPr>
+              <w:t>M3</w:t>
+            </w:r>
+          </w:p>
+        </w:tc>
+        <w:tc>
+          <w:tcPr>
+            <w:tcW w:w="4022" w:type="dxa"/>
+          </w:tcPr>
+          <w:p>
+            <w:pPr>
+              <w:rPr>
+                <w:rFonts w:cstheme="minorHAnsi"/>
+                <w:sz w:val="24"/>
+                <w:szCs w:val="24"/>
+              </w:rPr>
+            </w:pPr>
+            <w:r>
+              <w:rPr>
+                <w:rFonts w:cstheme="minorHAnsi"/>
+                <w:sz w:val="24"/>
+                <w:szCs w:val="24"/>
+              </w:rPr>
+              <w:t xml:space="preserve">Measures whether images are assigned to the correct event, validated before completion, and </w:t>
+            </w:r>
+            <w:r>
+              <w:rPr>
+                <w:rFonts w:cstheme="minorHAnsi"/>
+                <w:sz w:val="24"/>
+                <w:szCs w:val="24"/>
+              </w:rPr>
+              <w:lastRenderedPageBreak/>
+              <w:t>resumed from the first missing chunk after interruption.</w:t>
+            </w:r>
+          </w:p>
+        </w:tc>
+        <w:tc>
+          <w:tcPr>
+            <w:tcW w:w="3240" w:type="dxa"/>
+          </w:tcPr>
+          <w:p>
+            <w:pPr>
+              <w:rPr>
+                <w:rFonts w:cstheme="minorHAnsi"/>
+                <w:sz w:val="24"/>
+                <w:szCs w:val="24"/>
+              </w:rPr>
+            </w:pPr>
+            <w:r>
+              <w:rPr>
+                <w:rFonts w:cstheme="minorHAnsi"/>
+                <w:sz w:val="24"/>
+                <w:szCs w:val="24"/>
+              </w:rPr>
+              <w:lastRenderedPageBreak/>
+              <w:t xml:space="preserve">100% of image transfer tests pass. No incomplete or invalid image is marked complete. Resumed images </w:t>
+            </w:r>
+            <w:r>
+              <w:rPr>
+                <w:rFonts w:cstheme="minorHAnsi"/>
+                <w:sz w:val="24"/>
+                <w:szCs w:val="24"/>
+              </w:rPr>
+              <w:lastRenderedPageBreak/>
+              <w:t>match the original test images.</w:t>
+            </w:r>
+          </w:p>
+        </w:tc>
+        <w:tc>
+          <w:tcPr>
+            <w:tcW w:w="1165" w:type="dxa"/>
+          </w:tcPr>
+          <w:p>
+            <w:pPr>
+              <w:rPr>
+                <w:rFonts w:cstheme="minorHAnsi"/>
+                <w:sz w:val="24"/>
+                <w:szCs w:val="24"/>
+              </w:rPr>
+            </w:pPr>
+            <w:r>
+              <w:rPr>
+                <w:rFonts w:cstheme="minorHAnsi"/>
+                <w:sz w:val="24"/>
+                <w:szCs w:val="24"/>
+              </w:rPr>
+              <w:lastRenderedPageBreak/>
+              <w:t>R5, R6, R7</w:t>
+            </w:r>
+          </w:p>
+        </w:tc>
+      </w:tr>
+      <w:tr>
+        <w:tc>
+          <w:tcPr>
+            <w:tcW w:w="923" w:type="dxa"/>
+          </w:tcPr>
+          <w:p>
+            <w:pPr>
+              <w:rPr>
+                <w:rFonts w:cstheme="minorHAnsi"/>
+                <w:sz w:val="24"/>
+                <w:szCs w:val="24"/>
+              </w:rPr>
+            </w:pPr>
+            <w:r>
+              <w:rPr>
+                <w:rFonts w:cstheme="minorHAnsi"/>
+                <w:sz w:val="24"/>
+                <w:szCs w:val="24"/>
+              </w:rPr>
+              <w:t>M4</w:t>
+            </w:r>
+          </w:p>
+        </w:tc>
+        <w:tc>
+          <w:tcPr>
+            <w:tcW w:w="4022" w:type="dxa"/>
+          </w:tcPr>
+          <w:p>
+            <w:pPr>
+              <w:rPr>
+                <w:rFonts w:cstheme="minorHAnsi"/>
+                <w:sz w:val="24"/>
+                <w:szCs w:val="24"/>
+              </w:rPr>
+            </w:pPr>
+            <w:r>
+              <w:rPr>
+                <w:rFonts w:cstheme="minorHAnsi"/>
+                <w:sz w:val="24"/>
+                <w:szCs w:val="24"/>
+              </w:rPr>
+              <w:t>Measures whether event acknowledgment occurs only after the required evidence has been validated and saved.</w:t>
+            </w:r>
+          </w:p>
+        </w:tc>
+        <w:tc>
+          <w:tcPr>
+            <w:tcW w:w="3240" w:type="dxa"/>
+          </w:tcPr>
+          <w:p>
+            <w:pPr>
+              <w:rPr>
+                <w:rFonts w:cstheme="minorHAnsi"/>
+                <w:sz w:val="24"/>
+                <w:szCs w:val="24"/>
+              </w:rPr>
+            </w:pPr>
+            <w:r>
+              <w:rPr>
+                <w:rFonts w:cstheme="minorHAnsi"/>
+                <w:sz w:val="24"/>
+                <w:szCs w:val="24"/>
+              </w:rPr>
+              <w:t>100% of acknowledgment tests pass. No acknowledgment is sent when validation or saving fails.</w:t>
+            </w:r>
+          </w:p>
+        </w:tc>
+        <w:tc>
+          <w:tcPr>
+            <w:tcW w:w="1165" w:type="dxa"/>
+          </w:tcPr>
+          <w:p>
+            <w:pPr>
+              <w:rPr>
+                <w:rFonts w:cstheme="minorHAnsi"/>
+                <w:sz w:val="24"/>
+                <w:szCs w:val="24"/>
+              </w:rPr>
+            </w:pPr>
+          </w:p>
+          <w:p>
+            <w:pPr>
+              <w:rPr>
+                <w:rFonts w:cstheme="minorHAnsi"/>
+                <w:sz w:val="24"/>
+                <w:szCs w:val="24"/>
+              </w:rPr>
+            </w:pPr>
+            <w:r>
+              <w:rPr>
+                <w:rFonts w:cstheme="minorHAnsi"/>
+                <w:sz w:val="24"/>
+                <w:szCs w:val="24"/>
+              </w:rPr>
+              <w:t>R8</w:t>
+            </w:r>
+          </w:p>
+        </w:tc>
+      </w:tr>
+      <w:tr>
+        <w:tc>
+          <w:tcPr>
+            <w:tcW w:w="923" w:type="dxa"/>
+          </w:tcPr>
+          <w:p>
+            <w:pPr>
+              <w:rPr>
+                <w:rFonts w:cstheme="minorHAnsi"/>
+                <w:sz w:val="24"/>
+                <w:szCs w:val="24"/>
+              </w:rPr>
+            </w:pPr>
+            <w:r>
+              <w:rPr>
+                <w:rFonts w:cstheme="minorHAnsi"/>
+                <w:sz w:val="24"/>
+                <w:szCs w:val="24"/>
+              </w:rPr>
+              <w:t>M5</w:t>
+            </w:r>
+          </w:p>
+        </w:tc>
+        <w:tc>
+          <w:tcPr>
+            <w:tcW w:w="4022" w:type="dxa"/>
+          </w:tcPr>
+          <w:p>
+            <w:pPr>
+              <w:rPr>
+                <w:rFonts w:cstheme="minorHAnsi"/>
+                <w:sz w:val="24"/>
+                <w:szCs w:val="24"/>
+              </w:rPr>
+            </w:pPr>
+            <w:r>
+              <w:rPr>
+                <w:rFonts w:cstheme="minorHAnsi"/>
+                <w:sz w:val="24"/>
+                <w:szCs w:val="24"/>
+              </w:rPr>
+              <w:t>Measures whether saved incidents remain associated with the correct ride session.</w:t>
+            </w:r>
+          </w:p>
+        </w:tc>
+        <w:tc>
+          <w:tcPr>
+            <w:tcW w:w="3240" w:type="dxa"/>
+          </w:tcPr>
+          <w:p>
+            <w:pPr>
+              <w:rPr>
+                <w:rFonts w:cstheme="minorHAnsi"/>
+                <w:sz w:val="24"/>
+                <w:szCs w:val="24"/>
+              </w:rPr>
+            </w:pPr>
+            <w:r>
+              <w:rPr>
+                <w:rFonts w:cstheme="minorHAnsi"/>
+                <w:sz w:val="24"/>
+                <w:szCs w:val="24"/>
+              </w:rPr>
+              <w:t>100% of incident relationship and persistence tests pass. No valid incident is lost or assigned to the wrong session.</w:t>
+            </w:r>
+          </w:p>
+        </w:tc>
+        <w:tc>
+          <w:tcPr>
+            <w:tcW w:w="1165" w:type="dxa"/>
+          </w:tcPr>
+          <w:p>
+            <w:pPr>
+              <w:rPr>
+                <w:rFonts w:cstheme="minorHAnsi"/>
+                <w:sz w:val="24"/>
+                <w:szCs w:val="24"/>
+              </w:rPr>
+            </w:pPr>
+            <w:r>
+              <w:rPr>
+                <w:rFonts w:cstheme="minorHAnsi"/>
+                <w:sz w:val="24"/>
+                <w:szCs w:val="24"/>
+              </w:rPr>
+              <w:t>R9</w:t>
+            </w:r>
+          </w:p>
+        </w:tc>
+      </w:tr>
+      <w:tr>
+        <w:tc>
+          <w:tcPr>
+            <w:tcW w:w="923" w:type="dxa"/>
+          </w:tcPr>
+          <w:p>
+            <w:pPr>
+              <w:rPr>
+                <w:rFonts w:cstheme="minorHAnsi"/>
+                <w:sz w:val="24"/>
+                <w:szCs w:val="24"/>
+              </w:rPr>
+            </w:pPr>
+            <w:r>
+              <w:rPr>
+                <w:rFonts w:cstheme="minorHAnsi"/>
+                <w:sz w:val="24"/>
+                <w:szCs w:val="24"/>
+              </w:rPr>
+              <w:t>M6</w:t>
+            </w:r>
+          </w:p>
+        </w:tc>
+        <w:tc>
+          <w:tcPr>
+            <w:tcW w:w="4022" w:type="dxa"/>
+          </w:tcPr>
+          <w:p>
+            <w:pPr>
+              <w:rPr>
+                <w:rFonts w:cstheme="minorHAnsi"/>
+                <w:sz w:val="24"/>
+                <w:szCs w:val="24"/>
+              </w:rPr>
+            </w:pPr>
+            <w:r>
+              <w:rPr>
+                <w:rFonts w:cstheme="minorHAnsi"/>
+                <w:sz w:val="24"/>
+                <w:szCs w:val="24"/>
+              </w:rPr>
+              <w:t>Measures whether ride history follows the selected filters and page size.</w:t>
+            </w:r>
+          </w:p>
+        </w:tc>
+        <w:tc>
+          <w:tcPr>
+            <w:tcW w:w="3240" w:type="dxa"/>
+          </w:tcPr>
+          <w:p>
+            <w:pPr>
+              <w:rPr>
+                <w:rFonts w:cstheme="minorHAnsi"/>
+                <w:sz w:val="24"/>
+                <w:szCs w:val="24"/>
+              </w:rPr>
+            </w:pPr>
+            <w:r>
+              <w:rPr>
+                <w:rFonts w:cstheme="minorHAnsi"/>
+                <w:sz w:val="24"/>
+                <w:szCs w:val="24"/>
+              </w:rPr>
+              <w:t>100% of filtering and pag</w:t>
+            </w:r>
+            <w:r>
+              <w:rPr>
+                <w:rFonts w:cstheme="minorHAnsi"/>
+                <w:sz w:val="24"/>
+                <w:szCs w:val="24"/>
+              </w:rPr>
+              <w:t>e</w:t>
+            </w:r>
+            <w:r>
+              <w:rPr>
+                <w:rFonts w:cstheme="minorHAnsi"/>
+                <w:sz w:val="24"/>
+                <w:szCs w:val="24"/>
+              </w:rPr>
+              <w:t xml:space="preserve"> tests pass, including combined filters, empty results, and page boundaries.</w:t>
+            </w:r>
+          </w:p>
+        </w:tc>
+        <w:tc>
+          <w:tcPr>
+            <w:tcW w:w="1165" w:type="dxa"/>
+          </w:tcPr>
+          <w:p>
+            <w:pPr>
+              <w:rPr>
+                <w:rFonts w:cstheme="minorHAnsi"/>
+                <w:sz w:val="24"/>
+                <w:szCs w:val="24"/>
+              </w:rPr>
+            </w:pPr>
+            <w:r>
+              <w:rPr>
+                <w:rFonts w:cstheme="minorHAnsi"/>
+                <w:sz w:val="24"/>
+                <w:szCs w:val="24"/>
+              </w:rPr>
+              <w:t>R10, R11</w:t>
+            </w:r>
+          </w:p>
+        </w:tc>
+      </w:tr>
+      <w:tr>
+        <w:tc>
+          <w:tcPr>
+            <w:tcW w:w="923" w:type="dxa"/>
+          </w:tcPr>
+          <w:p>
+            <w:pPr>
+              <w:rPr>
+                <w:rFonts w:cstheme="minorHAnsi"/>
+                <w:sz w:val="24"/>
+                <w:szCs w:val="24"/>
+              </w:rPr>
+            </w:pPr>
+            <w:r>
+              <w:rPr>
+                <w:rFonts w:cstheme="minorHAnsi"/>
+                <w:sz w:val="24"/>
+                <w:szCs w:val="24"/>
+              </w:rPr>
+              <w:t>M7</w:t>
+            </w:r>
+          </w:p>
+        </w:tc>
+        <w:tc>
+          <w:tcPr>
+            <w:tcW w:w="4022" w:type="dxa"/>
+          </w:tcPr>
+          <w:p>
+            <w:pPr>
+              <w:tabs>
+                <w:tab w:val="left" w:pos="900"/>
+              </w:tabs>
+              <w:rPr>
+                <w:rFonts w:cstheme="minorHAnsi"/>
+                <w:sz w:val="24"/>
+                <w:szCs w:val="24"/>
+              </w:rPr>
+            </w:pPr>
+            <w:r>
+              <w:rPr>
+                <w:rFonts w:cstheme="minorHAnsi"/>
+                <w:sz w:val="24"/>
+                <w:szCs w:val="24"/>
+              </w:rPr>
+              <w:t>Measures whether the application correctly identifies complete and incomplete incidents using the required evidence fields.</w:t>
+            </w:r>
+          </w:p>
+        </w:tc>
+        <w:tc>
+          <w:tcPr>
+            <w:tcW w:w="3240" w:type="dxa"/>
+          </w:tcPr>
+          <w:p>
+            <w:pPr>
+              <w:rPr>
+                <w:rFonts w:cstheme="minorHAnsi"/>
+                <w:sz w:val="24"/>
+                <w:szCs w:val="24"/>
+              </w:rPr>
+            </w:pPr>
+            <w:r>
+              <w:rPr>
+                <w:rFonts w:cstheme="minorHAnsi"/>
+                <w:sz w:val="24"/>
+                <w:szCs w:val="24"/>
+              </w:rPr>
+              <w:t>100% of incident completeness tests pass. Missing required evidence results in an incomplete status</w:t>
+            </w:r>
+            <w:r>
+              <w:rPr>
+                <w:rFonts w:cstheme="minorHAnsi"/>
+                <w:sz w:val="24"/>
+                <w:szCs w:val="24"/>
+              </w:rPr>
+              <w:t xml:space="preserve"> but</w:t>
+            </w:r>
+            <w:r>
+              <w:rPr>
+                <w:rFonts w:cstheme="minorHAnsi"/>
+                <w:sz w:val="24"/>
+                <w:szCs w:val="24"/>
+              </w:rPr>
+              <w:t xml:space="preserve"> </w:t>
+            </w:r>
+            <w:r>
+              <w:rPr>
+                <w:rFonts w:cstheme="minorHAnsi"/>
+                <w:sz w:val="24"/>
+                <w:szCs w:val="24"/>
+              </w:rPr>
+              <w:t>m</w:t>
+            </w:r>
+            <w:r>
+              <w:rPr>
+                <w:rFonts w:cstheme="minorHAnsi"/>
+                <w:sz w:val="24"/>
+                <w:szCs w:val="24"/>
+              </w:rPr>
+              <w:t>issing optional information does not.</w:t>
+            </w:r>
+          </w:p>
+        </w:tc>
+        <w:tc>
+          <w:tcPr>
+            <w:tcW w:w="1165" w:type="dxa"/>
+          </w:tcPr>
+          <w:p>
+            <w:pPr>
+              <w:rPr>
+                <w:rFonts w:cstheme="minorHAnsi"/>
+                <w:sz w:val="24"/>
+                <w:szCs w:val="24"/>
+              </w:rPr>
+            </w:pPr>
+            <w:r>
+              <w:rPr>
+                <w:rFonts w:cstheme="minorHAnsi"/>
+                <w:sz w:val="24"/>
+                <w:szCs w:val="24"/>
+              </w:rPr>
+              <w:t>R12</w:t>
+            </w:r>
+          </w:p>
+        </w:tc>
+      </w:tr>
+      <w:tr>
+        <w:tc>
+          <w:tcPr>
+            <w:tcW w:w="923" w:type="dxa"/>
+          </w:tcPr>
+          <w:p>
+            <w:pPr>
+              <w:rPr>
+                <w:rFonts w:cstheme="minorHAnsi"/>
+                <w:sz w:val="24"/>
+                <w:szCs w:val="24"/>
+              </w:rPr>
+            </w:pPr>
+            <w:r>
+              <w:rPr>
+                <w:rFonts w:cstheme="minorHAnsi"/>
+                <w:sz w:val="24"/>
+                <w:szCs w:val="24"/>
+              </w:rPr>
+              <w:t>M8</w:t>
+            </w:r>
+          </w:p>
+        </w:tc>
+        <w:tc>
+          <w:tcPr>
+            <w:tcW w:w="4022" w:type="dxa"/>
+          </w:tcPr>
+          <w:p>
+            <w:pPr>
+              <w:rPr>
+                <w:rFonts w:cstheme="minorHAnsi"/>
+                <w:sz w:val="24"/>
+                <w:szCs w:val="24"/>
+              </w:rPr>
+            </w:pPr>
+            <w:r>
+              <w:rPr>
+                <w:rFonts w:cstheme="minorHAnsi"/>
+                <w:sz w:val="24"/>
+                <w:szCs w:val="24"/>
+              </w:rPr>
+              <w:t>Measures whether the ride session screen displays saved incident changes when the user returns to it.</w:t>
+            </w:r>
+          </w:p>
+        </w:tc>
+        <w:tc>
+          <w:tcPr>
+            <w:tcW w:w="3240" w:type="dxa"/>
+          </w:tcPr>
+          <w:p>
+            <w:pPr>
+              <w:rPr>
+                <w:rFonts w:cstheme="minorHAnsi"/>
+                <w:sz w:val="24"/>
+                <w:szCs w:val="24"/>
+              </w:rPr>
+            </w:pPr>
+            <w:r>
+              <w:rPr>
+                <w:rFonts w:cstheme="minorHAnsi"/>
+                <w:sz w:val="24"/>
+                <w:szCs w:val="24"/>
+              </w:rPr>
+              <w:t>100% of saved-change refresh tests pass. Displayed information matches the saved incident record.</w:t>
+            </w:r>
+          </w:p>
+        </w:tc>
+        <w:tc>
+          <w:tcPr>
+            <w:tcW w:w="1165" w:type="dxa"/>
+          </w:tcPr>
+          <w:p>
+            <w:r>
+              <w:t>R13</w:t>
+            </w:r>
+          </w:p>
           <w:p>
             <w:pPr>
               <w:rPr>
@@ -1161,11 +1840,19 @@
                 <w:szCs w:val="24"/>
               </w:rPr>
             </w:pPr>
+            <w:r>
+              <w:rPr>
+                <w:rFonts w:cstheme="minorHAnsi"/>
+                <w:sz w:val="24"/>
+                <w:szCs w:val="24"/>
+              </w:rPr>
+              <w:t>M9</w:t>
+            </w:r>
           </w:p>
         </w:tc>
         <w:tc>
           <w:tcPr>
-            <w:tcW w:w="3212" w:type="dxa"/>
+            <w:tcW w:w="4022" w:type="dxa"/>
           </w:tcPr>
           <w:p>
             <w:pPr>
@@ -1175,11 +1862,19 @@
                 <w:szCs w:val="24"/>
               </w:rPr>
             </w:pPr>
+            <w:r>
+              <w:rPr>
+                <w:rFonts w:cstheme="minorHAnsi"/>
+                <w:sz w:val="24"/>
+                <w:szCs w:val="24"/>
+              </w:rPr>
+              <w:t>Measures whether an exported PDF contains the selected incident’s evidence in a readable format.</w:t>
+            </w:r>
           </w:p>
         </w:tc>
         <w:tc>
           <w:tcPr>
-            <w:tcW w:w="3780" w:type="dxa"/>
+            <w:tcW w:w="3240" w:type="dxa"/>
           </w:tcPr>
           <w:p>
             <w:pPr>
@@ -1189,11 +1884,19 @@
                 <w:szCs w:val="24"/>
               </w:rPr>
             </w:pPr>
+            <w:r>
+              <w:rPr>
+                <w:rFonts w:cstheme="minorHAnsi"/>
+                <w:sz w:val="24"/>
+                <w:szCs w:val="24"/>
+              </w:rPr>
+              <w:t>100% of PDF report tests pass. Required evidence matches the selected incident, with no missing content, clipping, or overlapping text.</w:t>
+            </w:r>
           </w:p>
         </w:tc>
         <w:tc>
           <w:tcPr>
-            <w:tcW w:w="1435" w:type="dxa"/>
+            <w:tcW w:w="1165" w:type="dxa"/>
           </w:tcPr>
           <w:p>
             <w:pPr>
@@ -1203,6 +1906,14 @@
                 <w:szCs w:val="24"/>
               </w:rPr>
             </w:pPr>
+            <w:r>
+              <w:rPr>
+                <w:rFonts w:cstheme="minorHAnsi"/>
+                <w:sz w:val="24"/>
+                <w:szCs w:val="24"/>
+              </w:rPr>
+              <w:t>R14</w:t>
+            </w:r>
           </w:p>
         </w:tc>
       </w:tr>
@@ -1219,11 +1930,19 @@
                 <w:szCs w:val="24"/>
               </w:rPr>
             </w:pPr>
+            <w:r>
+              <w:rPr>
+                <w:rFonts w:cstheme="minorHAnsi"/>
+                <w:sz w:val="24"/>
+                <w:szCs w:val="24"/>
+              </w:rPr>
+              <w:t>M10</w:t>
+            </w:r>
           </w:p>
         </w:tc>
         <w:tc>
           <w:tcPr>
-            <w:tcW w:w="3212" w:type="dxa"/>
+            <w:tcW w:w="4022" w:type="dxa"/>
           </w:tcPr>
           <w:p>
             <w:pPr>
@@ -1233,11 +1952,19 @@
                 <w:szCs w:val="24"/>
               </w:rPr>
             </w:pPr>
+            <w:r>
+              <w:rPr>
+                <w:rFonts w:cstheme="minorHAnsi"/>
+                <w:sz w:val="24"/>
+                <w:szCs w:val="24"/>
+              </w:rPr>
+              <w:t>Measures whether the application transmits data according to the agreement with the outside team.</w:t>
+            </w:r>
           </w:p>
         </w:tc>
         <w:tc>
           <w:tcPr>
-            <w:tcW w:w="3780" w:type="dxa"/>
+            <w:tcW w:w="3240" w:type="dxa"/>
           </w:tcPr>
           <w:p>
             <w:pPr>
@@ -1247,11 +1974,19 @@
                 <w:szCs w:val="24"/>
               </w:rPr>
             </w:pPr>
+            <w:r>
+              <w:rPr>
+                <w:rFonts w:cstheme="minorHAnsi"/>
+                <w:sz w:val="24"/>
+                <w:szCs w:val="24"/>
+              </w:rPr>
+              <w:t xml:space="preserve">Acceptance criteria will be defined when the agreement establishes the required data, transmission behavior, and expected responses. </w:t>
+            </w:r>
           </w:p>
         </w:tc>
         <w:tc>
           <w:tcPr>
-            <w:tcW w:w="1435" w:type="dxa"/>
+            <w:tcW w:w="1165" w:type="dxa"/>
           </w:tcPr>
           <w:p>
             <w:pPr>
@@ -1261,6 +1996,14 @@
                 <w:szCs w:val="24"/>
               </w:rPr>
             </w:pPr>
+            <w:r>
+              <w:rPr>
+                <w:rFonts w:cstheme="minorHAnsi"/>
+                <w:sz w:val="24"/>
+                <w:szCs w:val="24"/>
+              </w:rPr>
+              <w:t>R16</w:t>
+            </w:r>
           </w:p>
         </w:tc>
       </w:tr>
@@ -1288,84 +2031,139 @@
           <w:sz w:val="24"/>
           <w:szCs w:val="24"/>
         </w:rPr>
-        <w:t xml:space="preserve">Rules: Environment testing is done in (native, </w:t>
-      </w:r>
-      <w:proofErr w:type="spellStart"/>
+        <w:t>The testing plan</w:t>
+      </w:r>
       <w:r>
         <w:rPr>
           <w:rFonts w:cstheme="minorHAnsi"/>
           <w:sz w:val="24"/>
           <w:szCs w:val="24"/>
         </w:rPr>
-        <w:t>etc</w:t>
-      </w:r>
-      <w:proofErr w:type="spellEnd"/>
+        <w:t xml:space="preserve"> (Reference All Test Cases.xlsx)</w:t>
+      </w:r>
       <w:r>
         <w:rPr>
           <w:rFonts w:cstheme="minorHAnsi"/>
           <w:sz w:val="24"/>
           <w:szCs w:val="24"/>
         </w:rPr>
-        <w:t xml:space="preserve">) and </w:t>
-      </w:r>
-      <w:proofErr w:type="spellStart"/>
+        <w:t xml:space="preserve"> will define the cases used to evaluate each metric</w:t>
+      </w:r>
       <w:r>
         <w:rPr>
           <w:rFonts w:cstheme="minorHAnsi"/>
           <w:sz w:val="24"/>
           <w:szCs w:val="24"/>
         </w:rPr>
-        <w:t>ios</w:t>
-      </w:r>
-      <w:proofErr w:type="spellEnd"/>
+        <w:t xml:space="preserve"> listed above</w:t>
+      </w:r>
       <w:r>
         <w:rPr>
           <w:rFonts w:cstheme="minorHAnsi"/>
           <w:sz w:val="24"/>
           <w:szCs w:val="24"/>
         </w:rPr>
-        <w:t>/android</w:t>
+        <w:t xml:space="preserve">. </w:t>
       </w:r>
     </w:p>
     <w:p>
       <w:pPr>
-        <w:pStyle w:val="Heading2"/>
-      </w:pPr>
-      <w:r>
-        <w:t>Testing Plan</w:t>
+        <w:rPr>
+          <w:rFonts w:cstheme="minorHAnsi"/>
+          <w:b/>
+          <w:bCs/>
+          <w:sz w:val="24"/>
+          <w:szCs w:val="24"/>
+        </w:rPr>
+      </w:pPr>
+      <w:r>
+        <w:rPr>
+          <w:rFonts w:cstheme="minorHAnsi"/>
+          <w:b/>
+          <w:bCs/>
+          <w:sz w:val="24"/>
+          <w:szCs w:val="24"/>
+        </w:rPr>
+        <w:t xml:space="preserve">Human </w:t>
+      </w:r>
+      <w:r>
+        <w:rPr>
+          <w:rFonts w:cstheme="minorHAnsi"/>
+          <w:b/>
+          <w:bCs/>
+          <w:sz w:val="24"/>
+          <w:szCs w:val="24"/>
+        </w:rPr>
+        <w:t>User Experience</w:t>
+      </w:r>
+      <w:r>
+        <w:rPr>
+          <w:rFonts w:cstheme="minorHAnsi"/>
+          <w:b/>
+          <w:bCs/>
+          <w:sz w:val="24"/>
+          <w:szCs w:val="24"/>
+        </w:rPr>
+        <w:t xml:space="preserve"> Testing</w:t>
       </w:r>
     </w:p>
     <w:p>
       <w:pPr>
         <w:rPr>
-          <w:sz w:val="24"/>
-          <w:szCs w:val="24"/>
-        </w:rPr>
-      </w:pPr>
-      <w:r>
-        <w:rPr>
-          <w:sz w:val="24"/>
-          <w:szCs w:val="24"/>
-        </w:rPr>
-        <w:t>How are tests created JEST/native/</w:t>
-      </w:r>
-      <w:proofErr w:type="spellStart"/>
-      <w:r>
-        <w:rPr>
-          <w:sz w:val="24"/>
-          <w:szCs w:val="24"/>
-        </w:rPr>
-        <w:t>db</w:t>
-      </w:r>
-      <w:proofErr w:type="spellEnd"/>
+          <w:rFonts w:cstheme="minorHAnsi"/>
+          <w:sz w:val="24"/>
+          <w:szCs w:val="24"/>
+        </w:rPr>
+      </w:pPr>
+      <w:r>
+        <w:rPr>
+          <w:rFonts w:cstheme="minorHAnsi"/>
+          <w:sz w:val="24"/>
+          <w:szCs w:val="24"/>
+        </w:rPr>
+        <w:lastRenderedPageBreak/>
+        <w:t xml:space="preserve">Human </w:t>
+      </w:r>
+      <w:r>
+        <w:rPr>
+          <w:rFonts w:cstheme="minorHAnsi"/>
+          <w:sz w:val="24"/>
+          <w:szCs w:val="24"/>
+        </w:rPr>
+        <w:t>user experience (</w:t>
+      </w:r>
+      <w:r>
+        <w:rPr>
+          <w:rFonts w:cstheme="minorHAnsi"/>
+          <w:sz w:val="24"/>
+          <w:szCs w:val="24"/>
+        </w:rPr>
+        <w:t>UX</w:t>
+      </w:r>
+      <w:r>
+        <w:rPr>
+          <w:rFonts w:cstheme="minorHAnsi"/>
+          <w:sz w:val="24"/>
+          <w:szCs w:val="24"/>
+        </w:rPr>
+        <w:t>)</w:t>
+      </w:r>
+      <w:r>
+        <w:rPr>
+          <w:rFonts w:cstheme="minorHAnsi"/>
+          <w:sz w:val="24"/>
+          <w:szCs w:val="24"/>
+        </w:rPr>
+        <w:t xml:space="preserve"> testing will evaluate how the application feels to use through participant feedback and observations. The findings will be summarized in a report to our sponsor, including difficulties users encountered and suggested improvements. These results will help guide design decisions but will not produce an automatic pass or fail for the application’s user experience.</w:t>
+      </w:r>
     </w:p>
     <w:p>
       <w:pPr>
-        <w:rPr>
-          <w:sz w:val="24"/>
-          <w:szCs w:val="24"/>
-        </w:rPr>
-      </w:pPr>
+        <w:pStyle w:val="Heading2"/>
+      </w:pPr>
+      <w:r>
+        <w:t>Testing Plan</w:t>
+      </w:r>
     </w:p>
     <w:p>
       <w:pPr>
@@ -1379,16 +2177,27 @@
           <w:sz w:val="24"/>
           <w:szCs w:val="24"/>
         </w:rPr>
-        <w:t>Session/incident rules</w:t>
+        <w:t>Testing will verify that the application meets the requirements in Section 2 and the quality metrics in Section 3. We will use automated tests for application logic, installed-app tests for native functionality, and physical-device tests for BLE communication. Human UX testing will provide feedback about how the application feels to use. Each test will record its expected result, actual result, and any problems found.</w:t>
       </w:r>
     </w:p>
     <w:p>
       <w:pPr>
         <w:rPr>
-          <w:sz w:val="24"/>
-          <w:szCs w:val="24"/>
-        </w:rPr>
-      </w:pPr>
+          <w:b/>
+          <w:bCs/>
+          <w:sz w:val="24"/>
+          <w:szCs w:val="24"/>
+        </w:rPr>
+      </w:pPr>
+      <w:r>
+        <w:rPr>
+          <w:b/>
+          <w:bCs/>
+          <w:sz w:val="24"/>
+          <w:szCs w:val="24"/>
+        </w:rPr>
+        <w:t>Testing Environments</w:t>
+      </w:r>
     </w:p>
     <w:p>
       <w:pPr>
@@ -1402,7 +2211,21 @@
           <w:sz w:val="24"/>
           <w:szCs w:val="24"/>
         </w:rPr>
-        <w:t>Data retention</w:t>
+        <w:t xml:space="preserve">Automated tests will use Jest with the jest-expo preset. React Native Testing Library will support tests of screen content and user interactions. These tests will use controlled data and mocks for dependencies such as BLE hardware, GPS, database access, and </w:t>
+      </w:r>
+      <w:r>
+        <w:rPr>
+          <w:sz w:val="24"/>
+          <w:szCs w:val="24"/>
+        </w:rPr>
+        <w:t xml:space="preserve">local </w:t>
+      </w:r>
+      <w:r>
+        <w:rPr>
+          <w:sz w:val="24"/>
+          <w:szCs w:val="24"/>
+        </w:rPr>
+        <w:t>file operations.</w:t>
       </w:r>
     </w:p>
     <w:p>
@@ -1412,6 +2235,48 @@
           <w:szCs w:val="24"/>
         </w:rPr>
       </w:pPr>
+      <w:r>
+        <w:rPr>
+          <w:sz w:val="24"/>
+          <w:szCs w:val="24"/>
+        </w:rPr>
+        <w:t xml:space="preserve">Native integration tests will run in installed development builds on Android and iOS. These tests will exercise the actual database, filesystem, permissions, and other platform-dependent behavior. </w:t>
+      </w:r>
+      <w:r>
+        <w:rPr>
+          <w:sz w:val="24"/>
+          <w:szCs w:val="24"/>
+        </w:rPr>
+        <w:t>Android and IOS e</w:t>
+      </w:r>
+      <w:r>
+        <w:rPr>
+          <w:sz w:val="24"/>
+          <w:szCs w:val="24"/>
+        </w:rPr>
+        <w:t xml:space="preserve">mulators </w:t>
+      </w:r>
+      <w:r>
+        <w:rPr>
+          <w:sz w:val="24"/>
+          <w:szCs w:val="24"/>
+        </w:rPr>
+        <w:t>will</w:t>
+      </w:r>
+      <w:r>
+        <w:rPr>
+          <w:sz w:val="24"/>
+          <w:szCs w:val="24"/>
+        </w:rPr>
+        <w:t xml:space="preserve"> support navigation and layout testing, but physical phones connected to the IBDC device will be used to verify BLE communication.</w:t>
+      </w:r>
+      <w:r>
+        <w:rPr>
+          <w:sz w:val="24"/>
+          <w:szCs w:val="24"/>
+        </w:rPr>
+        <w:t xml:space="preserve"> The current plan is for Jair and our sponsor to meet to set this up.</w:t>
+      </w:r>
     </w:p>
     <w:p>
       <w:pPr>
@@ -1425,16 +2290,43 @@
           <w:sz w:val="24"/>
           <w:szCs w:val="24"/>
         </w:rPr>
-        <w:t>Interfaces</w:t>
+        <w:t>Passing a test with a mock implementation does not establish that the corresponding native feature works. Applicable tests will therefore be repeated on both Android and iOS, with the device model, operating system, application build, and relevant firmware version recorded.</w:t>
+      </w:r>
+      <w:r>
+        <w:rPr>
+          <w:sz w:val="24"/>
+          <w:szCs w:val="24"/>
+        </w:rPr>
+        <w:t xml:space="preserve"> The passing operating system versions will be shared with our sponsor to present a view of what user devices he can expect the software to work on.</w:t>
       </w:r>
     </w:p>
     <w:p>
       <w:pPr>
         <w:rPr>
-          <w:sz w:val="24"/>
-          <w:szCs w:val="24"/>
-        </w:rPr>
-      </w:pPr>
+          <w:b/>
+          <w:bCs/>
+          <w:sz w:val="24"/>
+          <w:szCs w:val="24"/>
+        </w:rPr>
+      </w:pPr>
+      <w:r>
+        <w:rPr>
+          <w:b/>
+          <w:bCs/>
+          <w:sz w:val="24"/>
+          <w:szCs w:val="24"/>
+        </w:rPr>
+        <w:t xml:space="preserve">Test </w:t>
+      </w:r>
+      <w:r>
+        <w:rPr>
+          <w:b/>
+          <w:bCs/>
+          <w:sz w:val="24"/>
+          <w:szCs w:val="24"/>
+        </w:rPr>
+        <w:t>Setup</w:t>
+      </w:r>
     </w:p>
     <w:p>
       <w:pPr>
@@ -1443,15 +2335,42 @@
           <w:szCs w:val="24"/>
         </w:rPr>
       </w:pPr>
-      <w:proofErr w:type="spellStart"/>
-      <w:r>
-        <w:rPr>
-          <w:sz w:val="24"/>
-          <w:szCs w:val="24"/>
-        </w:rPr>
-        <w:t>Protobuf</w:t>
-      </w:r>
-      <w:proofErr w:type="spellEnd"/>
+      <w:r>
+        <w:rPr>
+          <w:sz w:val="24"/>
+          <w:szCs w:val="24"/>
+        </w:rPr>
+        <w:t xml:space="preserve">The existing test-case spreadsheet </w:t>
+      </w:r>
+      <w:r>
+        <w:rPr>
+          <w:rFonts w:cstheme="minorHAnsi"/>
+          <w:sz w:val="24"/>
+          <w:szCs w:val="24"/>
+        </w:rPr>
+        <w:t xml:space="preserve">(Reference All Test Cases.xlsx) </w:t>
+      </w:r>
+      <w:r>
+        <w:rPr>
+          <w:sz w:val="24"/>
+          <w:szCs w:val="24"/>
+        </w:rPr>
+        <w:t xml:space="preserve">will provide the starting inventory of inputs, outputs, and expected results. Additional cases will be added for PDF reports, server communication, and any </w:t>
+      </w:r>
+      <w:r>
+        <w:rPr>
+          <w:sz w:val="24"/>
+          <w:szCs w:val="24"/>
+        </w:rPr>
+        <w:t>so-far-</w:t>
+      </w:r>
+      <w:r>
+        <w:rPr>
+          <w:sz w:val="24"/>
+          <w:szCs w:val="24"/>
+        </w:rPr>
+        <w:t>uncovered requirements. Each case will identify its related requirement and quality metric.</w:t>
+      </w:r>
     </w:p>
     <w:p>
       <w:pPr>
@@ -1460,6 +2379,35 @@
           <w:szCs w:val="24"/>
         </w:rPr>
       </w:pPr>
+      <w:r>
+        <w:rPr>
+          <w:sz w:val="24"/>
+          <w:szCs w:val="24"/>
+        </w:rPr>
+        <w:t xml:space="preserve">Tests will create their own data and operate independently. Reusable factory functions will provide consistent sessions, incidents, images, and device messages. Tests involving timestamps or random data will use controlled values so results can be </w:t>
+      </w:r>
+      <w:r>
+        <w:rPr>
+          <w:sz w:val="24"/>
+          <w:szCs w:val="24"/>
+        </w:rPr>
+        <w:lastRenderedPageBreak/>
+        <w:t>repeated. Mocks, listeners, and temporary records will be reset between tests</w:t>
+      </w:r>
+      <w:r>
+        <w:rPr>
+          <w:sz w:val="24"/>
+          <w:szCs w:val="24"/>
+        </w:rPr>
+        <w:t xml:space="preserve"> unless a unique situation is found to require a no-reset test which will be documented.</w:t>
+      </w:r>
+      <w:r>
+        <w:rPr>
+          <w:sz w:val="24"/>
+          <w:szCs w:val="24"/>
+        </w:rPr>
+        <w:t>.</w:t>
+      </w:r>
     </w:p>
     <w:p>
       <w:pPr>
@@ -1468,13 +2416,6 @@
           <w:szCs w:val="24"/>
         </w:rPr>
       </w:pPr>
-      <w:r>
-        <w:rPr>
-          <w:sz w:val="24"/>
-          <w:szCs w:val="24"/>
-        </w:rPr>
-        <w:t>UI testing</w:t>
-      </w:r>
     </w:p>
     <w:p>
       <w:pPr>
@@ -1483,6 +2424,55 @@
           <w:szCs w:val="24"/>
         </w:rPr>
       </w:pPr>
+      <w:r>
+        <w:rPr>
+          <w:sz w:val="24"/>
+          <w:szCs w:val="24"/>
+        </w:rPr>
+        <w:t xml:space="preserve">BLE </w:t>
+      </w:r>
+      <w:r>
+        <w:rPr>
+          <w:sz w:val="24"/>
+          <w:szCs w:val="24"/>
+        </w:rPr>
+        <w:t>c</w:t>
+      </w:r>
+      <w:r>
+        <w:rPr>
+          <w:sz w:val="24"/>
+          <w:szCs w:val="24"/>
+        </w:rPr>
+        <w:t>onnection</w:t>
+      </w:r>
+      <w:r>
+        <w:rPr>
+          <w:sz w:val="24"/>
+          <w:szCs w:val="24"/>
+        </w:rPr>
+        <w:t>/r</w:t>
+      </w:r>
+      <w:r>
+        <w:rPr>
+          <w:sz w:val="24"/>
+          <w:szCs w:val="24"/>
+        </w:rPr>
+        <w:t xml:space="preserve">ecovery </w:t>
+      </w:r>
+      <w:r>
+        <w:rPr>
+          <w:sz w:val="24"/>
+          <w:szCs w:val="24"/>
+        </w:rPr>
+        <w:t>t</w:t>
+      </w:r>
+      <w:r>
+        <w:rPr>
+          <w:sz w:val="24"/>
+          <w:szCs w:val="24"/>
+        </w:rPr>
+        <w:t>est</w:t>
+      </w:r>
     </w:p>
     <w:p>
       <w:pPr>
@@ -1496,7 +2486,35 @@
           <w:sz w:val="24"/>
           <w:szCs w:val="24"/>
         </w:rPr>
-        <w:t>BLE</w:t>
+        <w:t xml:space="preserve">Protobuf </w:t>
+      </w:r>
+      <w:r>
+        <w:rPr>
+          <w:sz w:val="24"/>
+          <w:szCs w:val="24"/>
+        </w:rPr>
+        <w:t>c</w:t>
+      </w:r>
+      <w:r>
+        <w:rPr>
+          <w:sz w:val="24"/>
+          <w:szCs w:val="24"/>
+        </w:rPr>
+        <w:t xml:space="preserve">ommunication </w:t>
+      </w:r>
+      <w:r>
+        <w:rPr>
+          <w:sz w:val="24"/>
+          <w:szCs w:val="24"/>
+        </w:rPr>
+        <w:t>t</w:t>
+      </w:r>
+      <w:r>
+        <w:rPr>
+          <w:sz w:val="24"/>
+          <w:szCs w:val="24"/>
+        </w:rPr>
+        <w:t>est</w:t>
       </w:r>
     </w:p>
     <w:p>
@@ -1506,6 +2524,55 @@
           <w:szCs w:val="24"/>
         </w:rPr>
       </w:pPr>
+      <w:r>
+        <w:rPr>
+          <w:sz w:val="24"/>
+          <w:szCs w:val="24"/>
+        </w:rPr>
+        <w:t xml:space="preserve">Image </w:t>
+      </w:r>
+      <w:r>
+        <w:rPr>
+          <w:sz w:val="24"/>
+          <w:szCs w:val="24"/>
+        </w:rPr>
+        <w:t>t</w:t>
+      </w:r>
+      <w:r>
+        <w:rPr>
+          <w:sz w:val="24"/>
+          <w:szCs w:val="24"/>
+        </w:rPr>
+        <w:t xml:space="preserve">ransfer </w:t>
+      </w:r>
+      <w:r>
+        <w:rPr>
+          <w:sz w:val="24"/>
+          <w:szCs w:val="24"/>
+        </w:rPr>
+        <w:t>i</w:t>
+      </w:r>
+      <w:r>
+        <w:rPr>
+          <w:sz w:val="24"/>
+          <w:szCs w:val="24"/>
+        </w:rPr>
+        <w:t xml:space="preserve">ntegrity </w:t>
+      </w:r>
+      <w:r>
+        <w:rPr>
+          <w:sz w:val="24"/>
+          <w:szCs w:val="24"/>
+        </w:rPr>
+        <w:t>t</w:t>
+      </w:r>
+      <w:r>
+        <w:rPr>
+          <w:sz w:val="24"/>
+          <w:szCs w:val="24"/>
+        </w:rPr>
+        <w:t>est</w:t>
+      </w:r>
     </w:p>
     <w:p>
       <w:pPr>
@@ -1519,23 +2586,35 @@
           <w:sz w:val="24"/>
           <w:szCs w:val="24"/>
         </w:rPr>
-        <w:t xml:space="preserve">Human </w:t>
-      </w:r>
-      <w:proofErr w:type="spellStart"/>
-      <w:r>
-        <w:rPr>
-          <w:sz w:val="24"/>
-          <w:szCs w:val="24"/>
-        </w:rPr>
-        <w:t>ux</w:t>
-      </w:r>
-      <w:proofErr w:type="spellEnd"/>
-      <w:r>
-        <w:rPr>
-          <w:sz w:val="24"/>
-          <w:szCs w:val="24"/>
-        </w:rPr>
-        <w:t xml:space="preserve"> testing</w:t>
+        <w:t xml:space="preserve">Event </w:t>
+      </w:r>
+      <w:r>
+        <w:rPr>
+          <w:sz w:val="24"/>
+          <w:szCs w:val="24"/>
+        </w:rPr>
+        <w:t>register</w:t>
+      </w:r>
+      <w:r>
+        <w:rPr>
+          <w:sz w:val="24"/>
+          <w:szCs w:val="24"/>
+        </w:rPr>
+        <w:t xml:space="preserve"> </w:t>
+      </w:r>
+      <w:r>
+        <w:rPr>
+          <w:sz w:val="24"/>
+          <w:szCs w:val="24"/>
+        </w:rPr>
+        <w:t>t</w:t>
+      </w:r>
+      <w:r>
+        <w:rPr>
+          <w:sz w:val="24"/>
+          <w:szCs w:val="24"/>
+        </w:rPr>
+        <w:t>est</w:t>
       </w:r>
     </w:p>
     <w:p>
@@ -1545,6 +2624,55 @@
           <w:szCs w:val="24"/>
         </w:rPr>
       </w:pPr>
+      <w:r>
+        <w:rPr>
+          <w:sz w:val="24"/>
+          <w:szCs w:val="24"/>
+        </w:rPr>
+        <w:t xml:space="preserve">Incident </w:t>
+      </w:r>
+      <w:r>
+        <w:rPr>
+          <w:sz w:val="24"/>
+          <w:szCs w:val="24"/>
+        </w:rPr>
+        <w:t>d</w:t>
+      </w:r>
+      <w:r>
+        <w:rPr>
+          <w:sz w:val="24"/>
+          <w:szCs w:val="24"/>
+        </w:rPr>
+        <w:t xml:space="preserve">ata </w:t>
+      </w:r>
+      <w:r>
+        <w:rPr>
+          <w:sz w:val="24"/>
+          <w:szCs w:val="24"/>
+        </w:rPr>
+        <w:t>i</w:t>
+      </w:r>
+      <w:r>
+        <w:rPr>
+          <w:sz w:val="24"/>
+          <w:szCs w:val="24"/>
+        </w:rPr>
+        <w:t xml:space="preserve">ntegrity </w:t>
+      </w:r>
+      <w:r>
+        <w:rPr>
+          <w:sz w:val="24"/>
+          <w:szCs w:val="24"/>
+        </w:rPr>
+        <w:t>t</w:t>
+      </w:r>
+      <w:r>
+        <w:rPr>
+          <w:sz w:val="24"/>
+          <w:szCs w:val="24"/>
+        </w:rPr>
+        <w:t>est</w:t>
+      </w:r>
     </w:p>
     <w:p>
       <w:pPr>
@@ -1558,7 +2686,49 @@
           <w:sz w:val="24"/>
           <w:szCs w:val="24"/>
         </w:rPr>
-        <w:t>Exports</w:t>
+        <w:t xml:space="preserve">Ride </w:t>
+      </w:r>
+      <w:r>
+        <w:rPr>
+          <w:sz w:val="24"/>
+          <w:szCs w:val="24"/>
+        </w:rPr>
+        <w:t>h</w:t>
+      </w:r>
+      <w:r>
+        <w:rPr>
+          <w:sz w:val="24"/>
+          <w:szCs w:val="24"/>
+        </w:rPr>
+        <w:t xml:space="preserve">istory </w:t>
+      </w:r>
+      <w:r>
+        <w:rPr>
+          <w:sz w:val="24"/>
+          <w:szCs w:val="24"/>
+        </w:rPr>
+        <w:t>d</w:t>
+      </w:r>
+      <w:r>
+        <w:rPr>
+          <w:sz w:val="24"/>
+          <w:szCs w:val="24"/>
+        </w:rPr>
+        <w:t xml:space="preserve">isplay </w:t>
+      </w:r>
+      <w:r>
+        <w:rPr>
+          <w:sz w:val="24"/>
+          <w:szCs w:val="24"/>
+        </w:rPr>
+        <w:t>t</w:t>
+      </w:r>
+      <w:r>
+        <w:rPr>
+          <w:sz w:val="24"/>
+          <w:szCs w:val="24"/>
+        </w:rPr>
+        <w:t>est</w:t>
       </w:r>
     </w:p>
     <w:p>
@@ -1568,6 +2738,41 @@
           <w:szCs w:val="24"/>
         </w:rPr>
       </w:pPr>
+      <w:r>
+        <w:rPr>
+          <w:sz w:val="24"/>
+          <w:szCs w:val="24"/>
+        </w:rPr>
+        <w:t xml:space="preserve">Incident </w:t>
+      </w:r>
+      <w:r>
+        <w:rPr>
+          <w:sz w:val="24"/>
+          <w:szCs w:val="24"/>
+        </w:rPr>
+        <w:t>c</w:t>
+      </w:r>
+      <w:r>
+        <w:rPr>
+          <w:sz w:val="24"/>
+          <w:szCs w:val="24"/>
+        </w:rPr>
+        <w:t xml:space="preserve">ompleteness </w:t>
+      </w:r>
+      <w:r>
+        <w:rPr>
+          <w:sz w:val="24"/>
+          <w:szCs w:val="24"/>
+        </w:rPr>
+        <w:t>t</w:t>
+      </w:r>
+      <w:r>
+        <w:rPr>
+          <w:sz w:val="24"/>
+          <w:szCs w:val="24"/>
+        </w:rPr>
+        <w:t>est</w:t>
+      </w:r>
     </w:p>
     <w:p>
       <w:pPr>
@@ -1581,7 +2786,49 @@
           <w:sz w:val="24"/>
           <w:szCs w:val="24"/>
         </w:rPr>
-        <w:t>Long term testing</w:t>
+        <w:t xml:space="preserve">Saved </w:t>
+      </w:r>
+      <w:r>
+        <w:rPr>
+          <w:sz w:val="24"/>
+          <w:szCs w:val="24"/>
+        </w:rPr>
+        <w:t>i</w:t>
+      </w:r>
+      <w:r>
+        <w:rPr>
+          <w:sz w:val="24"/>
+          <w:szCs w:val="24"/>
+        </w:rPr>
+        <w:t xml:space="preserve">ncident </w:t>
+      </w:r>
+      <w:r>
+        <w:rPr>
+          <w:sz w:val="24"/>
+          <w:szCs w:val="24"/>
+        </w:rPr>
+        <w:t>c</w:t>
+      </w:r>
+      <w:r>
+        <w:rPr>
+          <w:sz w:val="24"/>
+          <w:szCs w:val="24"/>
+        </w:rPr>
+        <w:t xml:space="preserve">hanges </w:t>
+      </w:r>
+      <w:r>
+        <w:rPr>
+          <w:sz w:val="24"/>
+          <w:szCs w:val="24"/>
+        </w:rPr>
+        <w:t>t</w:t>
+      </w:r>
+      <w:r>
+        <w:rPr>
+          <w:sz w:val="24"/>
+          <w:szCs w:val="24"/>
+        </w:rPr>
+        <w:t>est</w:t>
       </w:r>
     </w:p>
     <w:p>
@@ -1591,6 +2838,41 @@
           <w:szCs w:val="24"/>
         </w:rPr>
       </w:pPr>
+      <w:r>
+        <w:rPr>
+          <w:sz w:val="24"/>
+          <w:szCs w:val="24"/>
+        </w:rPr>
+        <w:t xml:space="preserve">Incident PDF </w:t>
+      </w:r>
+      <w:r>
+        <w:rPr>
+          <w:sz w:val="24"/>
+          <w:szCs w:val="24"/>
+        </w:rPr>
+        <w:t>r</w:t>
+      </w:r>
+      <w:r>
+        <w:rPr>
+          <w:sz w:val="24"/>
+          <w:szCs w:val="24"/>
+        </w:rPr>
+        <w:t xml:space="preserve">eport </w:t>
+      </w:r>
+      <w:r>
+        <w:rPr>
+          <w:sz w:val="24"/>
+          <w:szCs w:val="24"/>
+        </w:rPr>
+        <w:t>t</w:t>
+      </w:r>
+      <w:r>
+        <w:rPr>
+          <w:sz w:val="24"/>
+          <w:szCs w:val="24"/>
+        </w:rPr>
+        <w:t>est</w:t>
+      </w:r>
     </w:p>
     <w:p>
       <w:pPr>
@@ -1604,7 +2886,144 @@
           <w:sz w:val="24"/>
           <w:szCs w:val="24"/>
         </w:rPr>
-        <w:t>documentation</w:t>
+        <w:t xml:space="preserve">Server </w:t>
+      </w:r>
+      <w:r>
+        <w:rPr>
+          <w:sz w:val="24"/>
+          <w:szCs w:val="24"/>
+        </w:rPr>
+        <w:t>d</w:t>
+      </w:r>
+      <w:r>
+        <w:rPr>
+          <w:sz w:val="24"/>
+          <w:szCs w:val="24"/>
+        </w:rPr>
+        <w:t xml:space="preserve">ata </w:t>
+      </w:r>
+      <w:r>
+        <w:rPr>
+          <w:sz w:val="24"/>
+          <w:szCs w:val="24"/>
+        </w:rPr>
+        <w:t>t</w:t>
+      </w:r>
+      <w:r>
+        <w:rPr>
+          <w:sz w:val="24"/>
+          <w:szCs w:val="24"/>
+        </w:rPr>
+        <w:t xml:space="preserve">ransmission </w:t>
+      </w:r>
+      <w:r>
+        <w:rPr>
+          <w:sz w:val="24"/>
+          <w:szCs w:val="24"/>
+        </w:rPr>
+        <w:t>t</w:t>
+      </w:r>
+      <w:r>
+        <w:rPr>
+          <w:sz w:val="24"/>
+          <w:szCs w:val="24"/>
+        </w:rPr>
+        <w:t>est</w:t>
+      </w:r>
+    </w:p>
+    <w:p>
+      <w:pPr>
+        <w:rPr>
+          <w:sz w:val="24"/>
+          <w:szCs w:val="24"/>
+        </w:rPr>
+      </w:pPr>
+      <w:r>
+        <w:rPr>
+          <w:sz w:val="24"/>
+          <w:szCs w:val="24"/>
+        </w:rPr>
+        <w:t xml:space="preserve">Human UX </w:t>
+      </w:r>
+      <w:r>
+        <w:rPr>
+          <w:sz w:val="24"/>
+          <w:szCs w:val="24"/>
+        </w:rPr>
+        <w:t>t</w:t>
+      </w:r>
+      <w:r>
+        <w:rPr>
+          <w:sz w:val="24"/>
+          <w:szCs w:val="24"/>
+        </w:rPr>
+        <w:t>est</w:t>
+      </w:r>
+    </w:p>
+    <w:p>
+      <w:pPr>
+        <w:rPr>
+          <w:sz w:val="24"/>
+          <w:szCs w:val="24"/>
+        </w:rPr>
+      </w:pPr>
+      <w:r>
+        <w:rPr>
+          <w:sz w:val="24"/>
+          <w:szCs w:val="24"/>
+        </w:rPr>
+        <w:t xml:space="preserve">Test </w:t>
+      </w:r>
+      <w:r>
+        <w:rPr>
+          <w:sz w:val="24"/>
+          <w:szCs w:val="24"/>
+        </w:rPr>
+        <w:t>r</w:t>
+      </w:r>
+      <w:r>
+        <w:rPr>
+          <w:sz w:val="24"/>
+          <w:szCs w:val="24"/>
+        </w:rPr>
+        <w:t>esults</w:t>
+      </w:r>
+      <w:r>
+        <w:rPr>
+          <w:sz w:val="24"/>
+          <w:szCs w:val="24"/>
+        </w:rPr>
+        <w:t>/r</w:t>
+      </w:r>
+      <w:r>
+        <w:rPr>
+          <w:sz w:val="24"/>
+          <w:szCs w:val="24"/>
+        </w:rPr>
+        <w:t>eview</w:t>
+      </w:r>
+    </w:p>
+    <w:p>
+      <w:pPr>
+        <w:rPr>
+          <w:sz w:val="24"/>
+          <w:szCs w:val="24"/>
+        </w:rPr>
+      </w:pPr>
+    </w:p>
+    <w:p>
+      <w:pPr>
+        <w:rPr>
+          <w:sz w:val="24"/>
+          <w:szCs w:val="24"/>
+        </w:rPr>
+      </w:pPr>
+      <w:r>
+        <w:rPr>
+          <w:sz w:val="24"/>
+          <w:szCs w:val="24"/>
+        </w:rPr>
+        <w:t>Summary</w:t>
       </w:r>
     </w:p>
     <w:sectPr>
@@ -3933,12 +5352,16 @@
   <w:rsids>
     <w:rsidRoot w:val="008F0D49"/>
     <w:rsid w:val="004811E6"/>
+    <w:rsid w:val="005145A9"/>
     <w:rsid w:val="005E70F9"/>
     <w:rsid w:val="005F0BB5"/>
+    <w:rsid w:val="00631615"/>
     <w:rsid w:val="008F0D49"/>
+    <w:rsid w:val="009760AD"/>
     <w:rsid w:val="00B61F4A"/>
     <w:rsid w:val="00B633F8"/>
     <w:rsid w:val="00CD724A"/>
+    <w:rsid w:val="00D0032D"/>
     <w:rsid w:val="00DA0536"/>
   </w:rsids>
   <m:mathPr>
@@ -4391,9 +5814,6 @@
   <w:style w:type="paragraph" w:customStyle="1" w:styleId="0BC5B1FD3BDF437183DECAE953444D69">
     <w:name w:val="0BC5B1FD3BDF437183DECAE953444D69"/>
   </w:style>
-  <w:style w:type="paragraph" w:customStyle="1" w:styleId="C2C6715AEC264141877E7AB07CAB9B90">
-    <w:name w:val="C2C6715AEC264141877E7AB07CAB9B90"/>
-  </w:style>
   <w:style w:type="paragraph" w:customStyle="1" w:styleId="0B1F8DECF9734208A15CEF81FCCE5918">
     <w:name w:val="0B1F8DECF9734208A15CEF81FCCE5918"/>
   </w:style>

</xml_diff>